<commit_message>
fix: app store link
</commit_message>
<xml_diff>
--- a/tailored_dev.docx
+++ b/tailored_dev.docx
@@ -20,7 +20,7 @@
           <w:b/>
           <w:bCs/>
         </w:rPr>
-        <w:t xml:space="preserve">Senior iOS Developer</w:t>
+        <w:t xml:space="preserve">Senior / Principal iOS &amp; Multi-Platform Software Engineer</w:t>
       </w:r>
       <w:r>
         <w:t xml:space="preserve"> </w:t>
@@ -108,7 +108,7 @@
           <w:i/>
           <w:iCs/>
         </w:rPr>
-        <w:t xml:space="preserve">Expert Native iOS Engineering:</w:t>
+        <w:t xml:space="preserve">Security-cleared native mobile engineer</w:t>
       </w:r>
       <w:r>
         <w:rPr>
@@ -122,7 +122,7 @@
           <w:i/>
           <w:iCs/>
         </w:rPr>
-        <w:t xml:space="preserve">Extensive experience building, optimizing, and shipping robust iOS applications using Swift, SwiftUI, and Objective-C to millions of users globally.</w:t>
+        <w:t xml:space="preserve">with extensive commercial experience delivering robust, high-performance iOS applications and SDKs using Swift, Objective-C, and C/C++.</w:t>
       </w:r>
     </w:p>
     <w:p>
@@ -136,7 +136,7 @@
           <w:i/>
           <w:iCs/>
         </w:rPr>
-        <w:t xml:space="preserve">High-Security &amp; Secure Systems:</w:t>
+        <w:t xml:space="preserve">Proven track record in secure architectures</w:t>
       </w:r>
       <w:r>
         <w:rPr>
@@ -150,7 +150,7 @@
           <w:i/>
           <w:iCs/>
         </w:rPr>
-        <w:t xml:space="preserve">Proven track record delivering secure mobile architectures for regulated environments, including a VPN-secured client for the UK Government and enterprise-grade penetration-tested applications.</w:t>
+        <w:t xml:space="preserve">including VPN-secured Government communications (SC Cleared) and penetration-remediated enterprise applications.</w:t>
       </w:r>
     </w:p>
     <w:p>
@@ -164,7 +164,7 @@
           <w:i/>
           <w:iCs/>
         </w:rPr>
-        <w:t xml:space="preserve">Modern Architecture &amp; Core SDKs:</w:t>
+        <w:t xml:space="preserve">Deep expertise in modern development patterns</w:t>
       </w:r>
       <w:r>
         <w:rPr>
@@ -178,7 +178,7 @@
           <w:i/>
           <w:iCs/>
         </w:rPr>
-        <w:t xml:space="preserve">Deep expertise in scalable patterns like MVVM, Combine, TCA, and Clean Architecture, with hands-on experience developing core mobile SDKs at scale for platforms like Sky and Living Map.</w:t>
+        <w:t xml:space="preserve">such as MVVM, Clean Architecture, Composable Architecture (TCA), and multi-platform native SDK design.</w:t>
       </w:r>
     </w:p>
     <w:p>
@@ -192,7 +192,7 @@
           <w:i/>
           <w:iCs/>
         </w:rPr>
-        <w:t xml:space="preserve">Full-Lifecycle App Delivery:</w:t>
+        <w:t xml:space="preserve">End-to-end automation specialist</w:t>
       </w:r>
       <w:r>
         <w:rPr>
@@ -206,7 +206,7 @@
           <w:i/>
           <w:iCs/>
         </w:rPr>
-        <w:t xml:space="preserve">Complete ownership of features end-to-end, from greenfield prototyping and automated App Store/TestFlight deployment to high-performance maintenance and optimization.</w:t>
+        <w:t xml:space="preserve">expert in App Store Connect, TestFlight, Fastlane, and high-efficiency CI/CD pipeline optimization.</w:t>
       </w:r>
     </w:p>
     <w:p>
@@ -220,7 +220,7 @@
           <w:i/>
           <w:iCs/>
         </w:rPr>
-        <w:t xml:space="preserve">Collaborative Agile Engineering:</w:t>
+        <w:t xml:space="preserve">Accomplished collaborative lead</w:t>
       </w:r>
       <w:r>
         <w:rPr>
@@ -234,7 +234,7 @@
           <w:i/>
           <w:iCs/>
         </w:rPr>
-        <w:t xml:space="preserve">Certified Scrum Master with a history of mentoring engineering teams, optimizing development workflows, and promoting high engineering standards in international teams.</w:t>
+        <w:t xml:space="preserve">with a focus on Agile processes, mentoring junior developers, and scaling white-label platforms.</w:t>
       </w:r>
     </w:p>
     <w:p>
@@ -246,7 +246,7 @@
           <w:b/>
           <w:bCs/>
         </w:rPr>
-        <w:t xml:space="preserve">Security, Performance, and Native iOS Engineering Match</w:t>
+        <w:t xml:space="preserve">Security-Focused High-Scale iOS Engineering Alignment</w:t>
       </w:r>
     </w:p>
     <w:p>
@@ -262,13 +262,13 @@
           <w:b/>
           <w:bCs/>
         </w:rPr>
-        <w:t xml:space="preserve">Native iOS &amp; Shipping Success:</w:t>
-      </w:r>
-      <w:r>
-        <w:t xml:space="preserve"> </w:t>
-      </w:r>
-      <w:r>
-        <w:t xml:space="preserve">Shipped multiple high-profile apps and SDKs to the Apple App Store, utilizing both Swift (SwiftUI, Combine, async/await) and Objective-C across enterprise and consumer domains.</w:t>
+        <w:t xml:space="preserve">Native iOS Engineering &amp; Tooling:</w:t>
+      </w:r>
+      <w:r>
+        <w:t xml:space="preserve"> </w:t>
+      </w:r>
+      <w:r>
+        <w:t xml:space="preserve">Proficient with Swift, Objective-C, Xcode, TestFlight, and App Store Connect, delivering multiple live apps to the Apple App Store.</w:t>
       </w:r>
     </w:p>
     <w:p>
@@ -284,13 +284,13 @@
           <w:b/>
           <w:bCs/>
         </w:rPr>
-        <w:t xml:space="preserve">Expert Tooling &amp; Automation:</w:t>
-      </w:r>
-      <w:r>
-        <w:t xml:space="preserve"> </w:t>
-      </w:r>
-      <w:r>
-        <w:t xml:space="preserve">Proficient with Xcode, TestFlight, and App Store Connect, with a history of overhauling release procedures and setting up robust Fastlane and GitHub Actions CI/CD pipelines.</w:t>
+        <w:t xml:space="preserve">Secure &amp; Optimized Architecture:</w:t>
+      </w:r>
+      <w:r>
+        <w:t xml:space="preserve"> </w:t>
+      </w:r>
+      <w:r>
+        <w:t xml:space="preserve">Deep hands-on experience implementing MVVM, TCA, and Clean Architecture alongside low-level C++, cryptography, and secure interop.</w:t>
       </w:r>
     </w:p>
     <w:p>
@@ -306,13 +306,13 @@
           <w:b/>
           <w:bCs/>
         </w:rPr>
-        <w:t xml:space="preserve">Scalable Architecture &amp; Design:</w:t>
-      </w:r>
-      <w:r>
-        <w:t xml:space="preserve"> </w:t>
-      </w:r>
-      <w:r>
-        <w:t xml:space="preserve">Deep practical knowledge of modern design patterns including MVVM, TCA, Redux, and Clean Architecture, ensuring robust, testable, and highly maintainable codebases.</w:t>
+        <w:t xml:space="preserve">Rigorous Penetration &amp; Security Remediations:</w:t>
+      </w:r>
+      <w:r>
+        <w:t xml:space="preserve"> </w:t>
+      </w:r>
+      <w:r>
+        <w:t xml:space="preserve">Proven ability to implement secure device identity, VPN-secured local storage, SSO, and secure payment integrations.</w:t>
       </w:r>
     </w:p>
     <w:p>
@@ -328,13 +328,13 @@
           <w:b/>
           <w:bCs/>
         </w:rPr>
-        <w:t xml:space="preserve">Security-First Development:</w:t>
-      </w:r>
-      <w:r>
-        <w:t xml:space="preserve"> </w:t>
-      </w:r>
-      <w:r>
-        <w:t xml:space="preserve">Handled secure mobile communication, VPN implementations, and enterprise MDM deployments for UK Government and major corporate clients, with an active focus on performance and optimization.</w:t>
+        <w:t xml:space="preserve">Scalable Product Delivery:</w:t>
+      </w:r>
+      <w:r>
+        <w:t xml:space="preserve"> </w:t>
+      </w:r>
+      <w:r>
+        <w:t xml:space="preserve">Led white-label platforms scaling to 13 applications, driving over £30M+ in annual revenue with automated release processes.</w:t>
       </w:r>
     </w:p>
     <w:p>
@@ -350,13 +350,35 @@
           <w:b/>
           <w:bCs/>
         </w:rPr>
-        <w:t xml:space="preserve">Collaborative Agile Delivery:</w:t>
-      </w:r>
-      <w:r>
-        <w:t xml:space="preserve"> </w:t>
-      </w:r>
-      <w:r>
-        <w:t xml:space="preserve">Certified Scrum Master experienced in cross-functional Agile workflows, git-based collaboration, code reviews, and mentoring team members to drive feature ownership and engineering excellence.</w:t>
+        <w:t xml:space="preserve">Low-Level Debugging &amp; Crash Analysis:</w:t>
+      </w:r>
+      <w:r>
+        <w:t xml:space="preserve"> </w:t>
+      </w:r>
+      <w:r>
+        <w:t xml:space="preserve">Extensive experience diagnosing complex tracebacks, memory leaks, and low-level system integrations for SDK environments.</w:t>
+      </w:r>
+    </w:p>
+    <w:p>
+      <w:pPr>
+        <w:pStyle w:val="Compact"/>
+        <w:numPr>
+          <w:ilvl w:val="0"/>
+          <w:numId w:val="1001"/>
+        </w:numPr>
+      </w:pPr>
+      <w:r>
+        <w:rPr>
+          <w:b/>
+          <w:bCs/>
+        </w:rPr>
+        <w:t xml:space="preserve">Agile &amp; Collaborative Workflows:</w:t>
+      </w:r>
+      <w:r>
+        <w:t xml:space="preserve"> </w:t>
+      </w:r>
+      <w:r>
+        <w:t xml:space="preserve">Certified Scrum Master possessing excellent track record working within international, multi-component development teams.</w:t>
       </w:r>
     </w:p>
     <w:p>
@@ -402,18 +424,8 @@
         </w:numPr>
       </w:pPr>
       <w:r>
-        <w:rPr>
-          <w:b/>
-          <w:bCs/>
-        </w:rPr>
         <w:t xml:space="preserve">Certified Scrum Master (CSM)</w:t>
       </w:r>
-      <w:r>
-        <w:t xml:space="preserve"> </w:t>
-      </w:r>
-      <w:r>
-        <w:t xml:space="preserve">— Scrum Alliance</w:t>
-      </w:r>
     </w:p>
     <w:p>
       <w:pPr>
@@ -436,19 +448,19 @@
           <w:b/>
           <w:bCs/>
         </w:rPr>
-        <w:t xml:space="preserve">Senior Developer | Floww Ltd.</w:t>
-      </w:r>
-      <w:r>
-        <w:t xml:space="preserve"> </w:t>
-      </w:r>
-      <w:r>
-        <w:t xml:space="preserve">May 2023 - September 2023</w:t>
-      </w:r>
-      <w:r>
-        <w:t xml:space="preserve"> </w:t>
-      </w:r>
-      <w:r>
-        <w:t xml:space="preserve">Keywords: [iOS, SwiftUI, TCA, Redux, CI/CD, Shell Scripting]</w:t>
+        <w:t xml:space="preserve">Lead Mobile Developer | Boostworks Ltd.</w:t>
+      </w:r>
+      <w:r>
+        <w:t xml:space="preserve"> </w:t>
+      </w:r>
+      <w:r>
+        <w:t xml:space="preserve">November 2023 - Present</w:t>
+      </w:r>
+      <w:r>
+        <w:t xml:space="preserve"> </w:t>
+      </w:r>
+      <w:r>
+        <w:t xml:space="preserve">Keywords: [React Native, TypeScript, iOS/Android, CI/CD (Fastlane/Azure), Apple/Google Pay, SSO, Penetration Testing]</w:t>
       </w:r>
     </w:p>
     <w:p>
@@ -460,7 +472,7 @@
         </w:numPr>
       </w:pPr>
       <w:r>
-        <w:t xml:space="preserve">Developed core features for a private investment market platform using modern SwiftUI and Composable Architecture (TCA).</w:t>
+        <w:t xml:space="preserve">Commercial Ownership &amp; Scale: Solely maintained a 60K-line multi-tenant codebase driving £30M+ annual revenue across 13 white-label iOS/Android apps for flagship enterprise clients.</w:t>
       </w:r>
     </w:p>
     <w:p>
@@ -472,7 +484,7 @@
         </w:numPr>
       </w:pPr>
       <w:r>
-        <w:t xml:space="preserve">Promoted engineering best practices, introducing componentization, git push lint hooks, and compile-time monitoring to optimize build and startup performance.</w:t>
+        <w:t xml:space="preserve">Platform Security &amp; Enterprise Payments: Led native component wrapping (Swift/Kotlin) for secure Apple/Google Pay integrations, executed penetration testing remediations, and integrated enterprise SSO.</w:t>
       </w:r>
     </w:p>
     <w:p>
@@ -484,7 +496,7 @@
         </w:numPr>
       </w:pPr>
       <w:r>
-        <w:t xml:space="preserve">Maintained automated CI/CD pipelines via GitHub Actions and mentored junior team members.</w:t>
+        <w:t xml:space="preserve">Automation &amp; CI/CD: Built end-to-end pipelines (Fastlane, Azure, OpenAPI) to slash new application deployment times by 90%.</w:t>
       </w:r>
     </w:p>
     <w:p>
@@ -496,19 +508,19 @@
           <w:b/>
           <w:bCs/>
         </w:rPr>
-        <w:t xml:space="preserve">Lead Mobile Developer | This One Ltd.</w:t>
-      </w:r>
-      <w:r>
-        <w:t xml:space="preserve"> </w:t>
-      </w:r>
-      <w:r>
-        <w:t xml:space="preserve">May 2022 - May 2023</w:t>
-      </w:r>
-      <w:r>
-        <w:t xml:space="preserve"> </w:t>
-      </w:r>
-      <w:r>
-        <w:t xml:space="preserve">Keywords: [SwiftUI, Combine, Async/Await, Fastlane, Python, GCP]</w:t>
+        <w:t xml:space="preserve">Senior iOS Developer | Sky</w:t>
+      </w:r>
+      <w:r>
+        <w:t xml:space="preserve"> </w:t>
+      </w:r>
+      <w:r>
+        <w:t xml:space="preserve">October 2021 - April 2022</w:t>
+      </w:r>
+      <w:r>
+        <w:t xml:space="preserve"> </w:t>
+      </w:r>
+      <w:r>
+        <w:t xml:space="preserve">Keywords: [Swift, Kotlin Multiplatform, SwiftUI, Video Streaming SDKs, Agile, Release Automation]</w:t>
       </w:r>
     </w:p>
     <w:p>
@@ -520,7 +532,7 @@
         </w:numPr>
       </w:pPr>
       <w:r>
-        <w:t xml:space="preserve">Led greenfield-to-seed-round development of an ML-based Movie Recommender app using SwiftUI, Combine, and async/await.</w:t>
+        <w:t xml:space="preserve">High-Scale SDK Management: Maintained a hybrid Swift and Kotlin Multiplatform Mobile (KMM) SDK and reference apps utilized daily by over 25 million customers.</w:t>
       </w:r>
     </w:p>
     <w:p>
@@ -532,7 +544,7 @@
         </w:numPr>
       </w:pPr>
       <w:r>
-        <w:t xml:space="preserve">Managed automated App Store and TestFlight deployment pipelines using Fastlane, streamlining product discovery and rapid releases.</w:t>
+        <w:t xml:space="preserve">Engineering Improvement: Rewrote the internal SDK reference application using SwiftUI, ensuring highly optimized performance and clean architecture.</w:t>
       </w:r>
     </w:p>
     <w:p>
@@ -544,7 +556,7 @@
         </w:numPr>
       </w:pPr>
       <w:r>
-        <w:t xml:space="preserve">Built mock backend servers in Python Flask and implemented proof-of-concept hybrid implementations across React Native and Ionic.</w:t>
+        <w:t xml:space="preserve">Release &amp; Delivery: Managed bi-weekly release cycles, release notes, and custom Probot/Octokit GitHub tools for repo automation.</w:t>
       </w:r>
     </w:p>
     <w:p>
@@ -556,19 +568,19 @@
           <w:b/>
           <w:bCs/>
         </w:rPr>
-        <w:t xml:space="preserve">Senior iOS Developer | Sky</w:t>
-      </w:r>
-      <w:r>
-        <w:t xml:space="preserve"> </w:t>
-      </w:r>
-      <w:r>
-        <w:t xml:space="preserve">October 2021 - April 2022</w:t>
-      </w:r>
-      <w:r>
-        <w:t xml:space="preserve"> </w:t>
-      </w:r>
-      <w:r>
-        <w:t xml:space="preserve">Keywords: [Swift, Kotlin Multiplatform, SwiftUI, Video Streaming, SDKs, Agile]</w:t>
+        <w:t xml:space="preserve">Senior Apple Engineer | Bugsnag Inc.</w:t>
+      </w:r>
+      <w:r>
+        <w:t xml:space="preserve"> </w:t>
+      </w:r>
+      <w:r>
+        <w:t xml:space="preserve">January 2020 - June 2020</w:t>
+      </w:r>
+      <w:r>
+        <w:t xml:space="preserve"> </w:t>
+      </w:r>
+      <w:r>
+        <w:t xml:space="preserve">Keywords: [Objective-C, C++, iOS, macOS, Crash Reporting, Open Source, Diagnostics]</w:t>
       </w:r>
     </w:p>
     <w:p>
@@ -580,7 +592,7 @@
         </w:numPr>
       </w:pPr>
       <w:r>
-        <w:t xml:space="preserve">Maintained a hybrid Swift and Kotlin Multiplatform Mobile (KMM) Core Video SDK supporting over 25 million active daily users.</w:t>
+        <w:t xml:space="preserve">Low-Level Diagnostics &amp; Cocoa/C++: Maintained high-performance open-source Bugsnag Cocoa and C/C++ diagnostic libraries serving global enterprise clients like Netflix, Nintendo, and Amazon.</w:t>
       </w:r>
     </w:p>
     <w:p>
@@ -592,7 +604,7 @@
         </w:numPr>
       </w:pPr>
       <w:r>
-        <w:t xml:space="preserve">Optimized SDK performance and rewrote the internal video streaming reference application in SwiftUI.</w:t>
+        <w:t xml:space="preserve">Root Cause Engineering: Conducted deep system diagnostics, handling complex multi-threaded stack traces, crash log analysis, and targeted patch releases.</w:t>
       </w:r>
     </w:p>
     <w:p>
@@ -604,7 +616,7 @@
         </w:numPr>
       </w:pPr>
       <w:r>
-        <w:t xml:space="preserve">Integrated streaming delivery technologies and analytics platforms, managing bi-weekly SDK release cycles.</w:t>
+        <w:t xml:space="preserve">Distribution Engineering: Managed library packaging across CocoaPods, Carthage, SPM, and manual installations.</w:t>
       </w:r>
     </w:p>
     <w:p>
@@ -616,19 +628,19 @@
           <w:b/>
           <w:bCs/>
         </w:rPr>
-        <w:t xml:space="preserve">Senior Apple Engineer | Bugsnag Inc.</w:t>
-      </w:r>
-      <w:r>
-        <w:t xml:space="preserve"> </w:t>
-      </w:r>
-      <w:r>
-        <w:t xml:space="preserve">January 2020 - June 2020</w:t>
-      </w:r>
-      <w:r>
-        <w:t xml:space="preserve"> </w:t>
-      </w:r>
-      <w:r>
-        <w:t xml:space="preserve">Keywords: [Objective-C, C++, iOS, macOS, Crash Reporting, Open Source]</w:t>
+        <w:t xml:space="preserve">Principal iOS Developer | Amiosec Ltd. (Contract)</w:t>
+      </w:r>
+      <w:r>
+        <w:t xml:space="preserve"> </w:t>
+      </w:r>
+      <w:r>
+        <w:t xml:space="preserve">March 2019 - December 2019</w:t>
+      </w:r>
+      <w:r>
+        <w:t xml:space="preserve"> </w:t>
+      </w:r>
+      <w:r>
+        <w:t xml:space="preserve">Keywords: [Xamarin, C#, Objective-C/Swift Interop, Security, SSL MiM, EWS, Foxhound Project]</w:t>
       </w:r>
     </w:p>
     <w:p>
@@ -640,7 +652,7 @@
         </w:numPr>
       </w:pPr>
       <w:r>
-        <w:t xml:space="preserve">Maintained open-source Bugsnag crash-reporting libraries for Apple platforms (iOS, macOS, watchOS, tvOS) in Objective-C and C++.</w:t>
+        <w:t xml:space="preserve">Secure Defense Communications: Engineered a custom VPN-secured Exchange email client for the UK Government’s secure Foxhound project.</w:t>
       </w:r>
     </w:p>
     <w:p>
@@ -652,7 +664,7 @@
         </w:numPr>
       </w:pPr>
       <w:r>
-        <w:t xml:space="preserve">Handled complex 3rd-line support issues, specializing in low-level crash log analysis, stack trace inspection, and root-cause isolation.</w:t>
+        <w:t xml:space="preserve">Secure Interoperability: Developed robust, secure interop bindings between Xamarin/C# and Objective-C/Swift utilizing .NET embedding.</w:t>
       </w:r>
     </w:p>
     <w:p>
@@ -664,7 +676,19 @@
         </w:numPr>
       </w:pPr>
       <w:r>
-        <w:t xml:space="preserve">Managed package distribution across SPM, CocoaPods, and Carthage with Travis and Buildkite automated testing.</w:t>
+        <w:t xml:space="preserve">Advanced Network Inspection: Reverse-engineered Exchange Web Services (EWS) using secure SSL Man-in-the-Middle proxying via Charles Proxy.</w:t>
+      </w:r>
+    </w:p>
+    <w:p>
+      <w:pPr>
+        <w:pStyle w:val="Compact"/>
+        <w:numPr>
+          <w:ilvl w:val="0"/>
+          <w:numId w:val="1006"/>
+        </w:numPr>
+      </w:pPr>
+      <w:r>
+        <w:t xml:space="preserve">Modern Reactive Patterns: Implemented MVVM architecture leveraging ReactiveUI, DynamicData, and Realm.NET with robust error handling via Polly.</w:t>
       </w:r>
     </w:p>
     <w:p>
@@ -676,19 +700,19 @@
           <w:b/>
           <w:bCs/>
         </w:rPr>
-        <w:t xml:space="preserve">Principal iOS Developer | Amiosec Ltd. (Contract)</w:t>
-      </w:r>
-      <w:r>
-        <w:t xml:space="preserve"> </w:t>
-      </w:r>
-      <w:r>
-        <w:t xml:space="preserve">March 2019 - December 2019</w:t>
-      </w:r>
-      <w:r>
-        <w:t xml:space="preserve"> </w:t>
-      </w:r>
-      <w:r>
-        <w:t xml:space="preserve">Keywords: [Xamarin, C#, Objective-C, Swift Interop, Security, EWS]</w:t>
+        <w:t xml:space="preserve">Principal iOS Developer | Dyson Ltd. (Contract)</w:t>
+      </w:r>
+      <w:r>
+        <w:t xml:space="preserve"> </w:t>
+      </w:r>
+      <w:r>
+        <w:t xml:space="preserve">June 2017 - January 2020</w:t>
+      </w:r>
+      <w:r>
+        <w:t xml:space="preserve"> </w:t>
+      </w:r>
+      <w:r>
+        <w:t xml:space="preserve">Keywords: [iOS, Enterprise MDM, ARKit, RealmDB, Swift, Unit Testing, Penetration Testing]</w:t>
       </w:r>
     </w:p>
     <w:p>
@@ -700,7 +724,13 @@
         </w:numPr>
       </w:pPr>
       <w:r>
-        <w:t xml:space="preserve">Architected and built a custom VPN-secured Exchange email client for the UK Government’s Foxhound secure communications project.</w:t>
+        <w:t xml:space="preserve">Enterprise iOS Engineering: Designed and delivered Dyson’s first B2B sales iPad app (</w:t>
+      </w:r>
+      <w:r>
+        <w:t xml:space="preserve">‘Hero’</w:t>
+      </w:r>
+      <w:r>
+        <w:t xml:space="preserve">) for global deployment to hundreds of staff.</w:t>
       </w:r>
     </w:p>
     <w:p>
@@ -712,7 +742,7 @@
         </w:numPr>
       </w:pPr>
       <w:r>
-        <w:t xml:space="preserve">Developed low-level cross-language interop between Xamarin/C# and Objective-C/Swift using .NET embedding.</w:t>
+        <w:t xml:space="preserve">Secure Enterprise Integration: Managed end-to-end integration covering AirWatch enterprise MDM deployment, extensive penetration testing, and secure CMS backends.</w:t>
       </w:r>
     </w:p>
     <w:p>
@@ -724,7 +754,7 @@
         </w:numPr>
       </w:pPr>
       <w:r>
-        <w:t xml:space="preserve">Reverse-engineered Exchange Web Services (EWS) via SSL Man-in-the-Middle proxying to ensure strict security and protocol compliance.</w:t>
+        <w:t xml:space="preserve">Robust Architecture &amp; Testing: Achieved over 80% UI and Unit Test coverage utilizing RealmDB and custom Xcode project templates.</w:t>
       </w:r>
     </w:p>
     <w:p>
@@ -748,13 +778,13 @@
           <w:b/>
           <w:bCs/>
         </w:rPr>
-        <w:t xml:space="preserve">1996 - 2021</w:t>
-      </w:r>
-      <w:r>
-        <w:t xml:space="preserve"> </w:t>
-      </w:r>
-      <w:r>
-        <w:t xml:space="preserve">Engineering roles covering iOS SDK development, enterprise security, hardware-level software, middleware, and network analytics.</w:t>
+        <w:t xml:space="preserve">2012 - 2023</w:t>
+      </w:r>
+      <w:r>
+        <w:t xml:space="preserve"> </w:t>
+      </w:r>
+      <w:r>
+        <w:t xml:space="preserve">Broad engineering roles spanning private equity fintech platforms, mapping SDKs, startup growth, and high-performance network analytics.</w:t>
       </w:r>
     </w:p>
     <w:p>
@@ -786,13 +816,13 @@
           <w:i/>
           <w:iCs/>
         </w:rPr>
-        <w:t xml:space="preserve">Living Map Ltd.</w:t>
-      </w:r>
-      <w:r>
-        <w:t xml:space="preserve"> </w:t>
-      </w:r>
-      <w:r>
-        <w:t xml:space="preserve">(iOS, Mapping SDK, XCFrameworks, CocoaPods, Carthage)</w:t>
+        <w:t xml:space="preserve">Floww Ltd</w:t>
+      </w:r>
+      <w:r>
+        <w:t xml:space="preserve"> </w:t>
+      </w:r>
+      <w:r>
+        <w:t xml:space="preserve">(iOS, SwiftUI, TCA, Redux, CI/CD, Git hooks)</w:t>
       </w:r>
     </w:p>
     <w:p>
@@ -808,7 +838,7 @@
           <w:b/>
           <w:bCs/>
         </w:rPr>
-        <w:t xml:space="preserve">Principal iOS Developer (Contract)</w:t>
+        <w:t xml:space="preserve">Lead Mobile Developer</w:t>
       </w:r>
       <w:r>
         <w:t xml:space="preserve"> </w:t>
@@ -824,13 +854,13 @@
           <w:i/>
           <w:iCs/>
         </w:rPr>
-        <w:t xml:space="preserve">Dyson Ltd.</w:t>
-      </w:r>
-      <w:r>
-        <w:t xml:space="preserve"> </w:t>
-      </w:r>
-      <w:r>
-        <w:t xml:space="preserve">(iOS, Swift, ARKit, RealmDB, AirWatch MDM, Unit Testing)</w:t>
+        <w:t xml:space="preserve">This One Ltd</w:t>
+      </w:r>
+      <w:r>
+        <w:t xml:space="preserve"> </w:t>
+      </w:r>
+      <w:r>
+        <w:t xml:space="preserve">(SwiftUI, Combine, Async/Await, Python, Flask, Fastlane, GCP)</w:t>
       </w:r>
     </w:p>
     <w:p>
@@ -846,7 +876,7 @@
           <w:b/>
           <w:bCs/>
         </w:rPr>
-        <w:t xml:space="preserve">Head of Mobile Development</w:t>
+        <w:t xml:space="preserve">Senior Developer</w:t>
       </w:r>
       <w:r>
         <w:t xml:space="preserve"> </w:t>
@@ -862,13 +892,13 @@
           <w:i/>
           <w:iCs/>
         </w:rPr>
-        <w:t xml:space="preserve">Actual Experience Ltd.</w:t>
-      </w:r>
-      <w:r>
-        <w:t xml:space="preserve"> </w:t>
-      </w:r>
-      <w:r>
-        <w:t xml:space="preserve">(Objective-C, Swift, CoreData, Low-Level Networking, Jenkins)</w:t>
+        <w:t xml:space="preserve">Living Map Ltd</w:t>
+      </w:r>
+      <w:r>
+        <w:t xml:space="preserve"> </w:t>
+      </w:r>
+      <w:r>
+        <w:t xml:space="preserve">(iOS, XCFrameworks, CocoaPods, Carthage, Background Location)</w:t>
       </w:r>
     </w:p>
     <w:p>
@@ -884,7 +914,7 @@
           <w:b/>
           <w:bCs/>
         </w:rPr>
-        <w:t xml:space="preserve">Principal Mobile Developer (Contract)</w:t>
+        <w:t xml:space="preserve">Head of Mobile Development</w:t>
       </w:r>
       <w:r>
         <w:t xml:space="preserve"> </w:t>
@@ -900,13 +930,13 @@
           <w:i/>
           <w:iCs/>
         </w:rPr>
-        <w:t xml:space="preserve">Accident Exchange Group</w:t>
-      </w:r>
-      <w:r>
-        <w:t xml:space="preserve"> </w:t>
-      </w:r>
-      <w:r>
-        <w:t xml:space="preserve">(iOS, CoreLocation, MapKit, CoreData, RestKit)</w:t>
+        <w:t xml:space="preserve">Actual Experience Ltd.</w:t>
+      </w:r>
+      <w:r>
+        <w:t xml:space="preserve"> </w:t>
+      </w:r>
+      <w:r>
+        <w:t xml:space="preserve">(Objective-C, Swift, CoreData, Realm, Low-level Networking (ICMP/TCP))</w:t>
       </w:r>
     </w:p>
     <w:p>
@@ -922,7 +952,7 @@
           <w:b/>
           <w:bCs/>
         </w:rPr>
-        <w:t xml:space="preserve">Senior Middleware &amp; DevOps Developer</w:t>
+        <w:t xml:space="preserve">Principal Mobile Developer</w:t>
       </w:r>
       <w:r>
         <w:t xml:space="preserve"> </w:t>
@@ -938,13 +968,13 @@
           <w:i/>
           <w:iCs/>
         </w:rPr>
-        <w:t xml:space="preserve">MySpace</w:t>
-      </w:r>
-      <w:r>
-        <w:t xml:space="preserve"> </w:t>
-      </w:r>
-      <w:r>
-        <w:t xml:space="preserve">(Java, Python, JBoss, Drools, Puppet, Objective-C)</w:t>
+        <w:t xml:space="preserve">Accident Exchange Group (Contract)</w:t>
+      </w:r>
+      <w:r>
+        <w:t xml:space="preserve"> </w:t>
+      </w:r>
+      <w:r>
+        <w:t xml:space="preserve">(iOS, CoreData, CoreLocation, MapKit, RestKit)</w:t>
       </w:r>
     </w:p>
     <w:p>
@@ -960,7 +990,7 @@
           <w:b/>
           <w:bCs/>
         </w:rPr>
-        <w:t xml:space="preserve">Senior Developer</w:t>
+        <w:t xml:space="preserve">Senior Middleware &amp; DevOps Developer</w:t>
       </w:r>
       <w:r>
         <w:t xml:space="preserve"> </w:t>
@@ -976,13 +1006,13 @@
           <w:i/>
           <w:iCs/>
         </w:rPr>
-        <w:t xml:space="preserve">RMS Services Ltd.</w:t>
-      </w:r>
-      <w:r>
-        <w:t xml:space="preserve"> </w:t>
-      </w:r>
-      <w:r>
-        <w:t xml:space="preserve">(Python, PostgreSQL, RESTful APIs, Network Discovery)</w:t>
+        <w:t xml:space="preserve">MySpace</w:t>
+      </w:r>
+      <w:r>
+        <w:t xml:space="preserve"> </w:t>
+      </w:r>
+      <w:r>
+        <w:t xml:space="preserve">(Java, Python, JBoss, Puppet, Objective-C)</w:t>
       </w:r>
     </w:p>
     <w:p>
@@ -998,7 +1028,7 @@
           <w:b/>
           <w:bCs/>
         </w:rPr>
-        <w:t xml:space="preserve">Aerodynamics &amp; Mass Properties Engineer</w:t>
+        <w:t xml:space="preserve">Senior Developer / Engineer</w:t>
       </w:r>
       <w:r>
         <w:t xml:space="preserve"> </w:t>
@@ -1014,13 +1044,13 @@
           <w:i/>
           <w:iCs/>
         </w:rPr>
-        <w:t xml:space="preserve">Airbus UK Ltd.</w:t>
-      </w:r>
-      <w:r>
-        <w:t xml:space="preserve"> </w:t>
-      </w:r>
-      <w:r>
-        <w:t xml:space="preserve">(Python, PyQt, Perl, PDL, OpenGL)</w:t>
+        <w:t xml:space="preserve">RMS Services Ltd / Airbus UK</w:t>
+      </w:r>
+      <w:r>
+        <w:t xml:space="preserve"> </w:t>
+      </w:r>
+      <w:r>
+        <w:t xml:space="preserve">(Python, PostgreSQL, PyQt, C/C++, OpenGL)</w:t>
       </w:r>
     </w:p>
     <w:p>
@@ -1052,13 +1082,13 @@
           <w:i/>
           <w:iCs/>
         </w:rPr>
-        <w:t xml:space="preserve">Sift / Appliance Studio / Obtree / Circle.com</w:t>
-      </w:r>
-      <w:r>
-        <w:t xml:space="preserve"> </w:t>
-      </w:r>
-      <w:r>
-        <w:t xml:space="preserve">(Linux, Embedded Java, Perl, C, Web Infrastructure)</w:t>
+        <w:t xml:space="preserve">Sift / Appliance Studio / Obtree</w:t>
+      </w:r>
+      <w:r>
+        <w:t xml:space="preserve"> </w:t>
+      </w:r>
+      <w:r>
+        <w:t xml:space="preserve">(Linux, Embedded Systems, Java, Perl, C)</w:t>
       </w:r>
     </w:p>
     <w:p>
@@ -1082,7 +1112,7 @@
         </w:numPr>
       </w:pPr>
       <w:r>
-        <w:t xml:space="preserve">Bricksmith: SourceForge award-winning LEGO CAD software for macOS built with Objective-C and C.</w:t>
+        <w:t xml:space="preserve">Bricksmith: SourceForge award-winning LEGO CAD software for macOS (Objective-C/C).</w:t>
       </w:r>
     </w:p>
     <w:p>
@@ -1094,7 +1124,7 @@
         </w:numPr>
       </w:pPr>
       <w:r>
-        <w:t xml:space="preserve">React Native Input Spinner: Contributor to open-source UI component library.</w:t>
+        <w:t xml:space="preserve">Pycel: Python-based Excel dependency graph and compiler formula parser.</w:t>
       </w:r>
     </w:p>
     <w:p>
@@ -1106,7 +1136,7 @@
         </w:numPr>
       </w:pPr>
       <w:r>
-        <w:t xml:space="preserve">Pycel / Excel Formula Parser: Python-based Excel dependency graph and formula parser engine.</w:t>
+        <w:t xml:space="preserve">React Native Input Spinner: Regular contributor to popular open-source UI component.</w:t>
       </w:r>
     </w:p>
     <w:p>
@@ -1118,7 +1148,19 @@
         </w:numPr>
       </w:pPr>
       <w:r>
-        <w:t xml:space="preserve">Coding Exercises: Solutions and performance-optimized interview algorithms in Swift and Python.</w:t>
+        <w:t xml:space="preserve">RMHelpfulLabel: Open-source custom iOS UI helper components and utility libraries.</w:t>
+      </w:r>
+    </w:p>
+    <w:p>
+      <w:pPr>
+        <w:pStyle w:val="Compact"/>
+        <w:numPr>
+          <w:ilvl w:val="0"/>
+          <w:numId w:val="1009"/>
+        </w:numPr>
+      </w:pPr>
+      <w:r>
+        <w:t xml:space="preserve">Coding Exercises: Public repository of algorithms and structured programming solutions.</w:t>
       </w:r>
     </w:p>
     <w:p>
@@ -1142,7 +1184,7 @@
           <w:b/>
           <w:bCs/>
         </w:rPr>
-        <w:t xml:space="preserve">iOS &amp; Apple Platforms</w:t>
+        <w:t xml:space="preserve">Native iOS Ecosystem &amp; Languages</w:t>
       </w:r>
       <w:r>
         <w:t xml:space="preserve"> </w:t>
@@ -1160,13 +1202,13 @@
           <w:b/>
           <w:bCs/>
         </w:rPr>
-        <w:t xml:space="preserve">Tooling &amp; Automation</w:t>
-      </w:r>
-      <w:r>
-        <w:t xml:space="preserve"> </w:t>
-      </w:r>
-      <w:r>
-        <w:t xml:space="preserve">- Xcode, TestFlight, App Store Connect, Fastlane, SPM, CocoaPods, Carthage, GitHub Actions, Travis CI</w:t>
+        <w:t xml:space="preserve">Security &amp; Architecture</w:t>
+      </w:r>
+      <w:r>
+        <w:t xml:space="preserve"> </w:t>
+      </w:r>
+      <w:r>
+        <w:t xml:space="preserve">- VPN integrations, Penetration testing remediation, SSO, Apple/Google Pay, MVVM, TCA, Clean Architecture, Scrum (CSM)</w:t>
       </w:r>
     </w:p>
     <w:p>
@@ -1178,13 +1220,13 @@
           <w:b/>
           <w:bCs/>
         </w:rPr>
-        <w:t xml:space="preserve">Security &amp; Core Systems</w:t>
-      </w:r>
-      <w:r>
-        <w:t xml:space="preserve"> </w:t>
-      </w:r>
-      <w:r>
-        <w:t xml:space="preserve">- VPN Integration, AirWatch MDM, Penetration Testing, Low-Level Networking (TCP/ICMP), C/C++, C#, Kotlin Multiplatform (KMM)</w:t>
+        <w:t xml:space="preserve">Tooling &amp; Delivery</w:t>
+      </w:r>
+      <w:r>
+        <w:t xml:space="preserve"> </w:t>
+      </w:r>
+      <w:r>
+        <w:t xml:space="preserve">- Xcode, TestFlight, App Store Connect, Fastlane, Git, GitHub Actions, Azure Pipelines, xcodebuild, SPM, CocoaPods, Carthage</w:t>
       </w:r>
     </w:p>
     <w:p>
@@ -1196,13 +1238,13 @@
           <w:b/>
           <w:bCs/>
         </w:rPr>
-        <w:t xml:space="preserve">Backend &amp; Scripting</w:t>
-      </w:r>
-      <w:r>
-        <w:t xml:space="preserve"> </w:t>
-      </w:r>
-      <w:r>
-        <w:t xml:space="preserve">- Python (FastAPI, Flask), PostgreSQL, Docker, Shell Scripting, RESTful APIs, Git</w:t>
+        <w:t xml:space="preserve">Multi-Platform &amp; Systems</w:t>
+      </w:r>
+      <w:r>
+        <w:t xml:space="preserve"> </w:t>
+      </w:r>
+      <w:r>
+        <w:t xml:space="preserve">- C/C++, Python (FastAPI, Flask), Kotlin Multiplatform (KMM), C#, Docker, Shell Scripting</w:t>
       </w:r>
     </w:p>
     <w:bookmarkEnd w:id="13"/>

</xml_diff>

<commit_message>
feature: app store links
</commit_message>
<xml_diff>
--- a/tailored_dev.docx
+++ b/tailored_dev.docx
@@ -2,7 +2,7 @@
 <file path=word/document.xml><?xml version="1.0" encoding="utf-8"?>
 <w:document xmlns:w="http://schemas.openxmlformats.org/wordprocessingml/2006/main" xmlns:m="http://schemas.openxmlformats.org/officeDocument/2006/math" xmlns:r="http://schemas.openxmlformats.org/officeDocument/2006/relationships" xmlns:o="urn:schemas-microsoft-com:office:office" xmlns:v="urn:schemas-microsoft-com:vml" xmlns:w10="urn:schemas-microsoft-com:office:word" xmlns:a="http://schemas.openxmlformats.org/drawingml/2006/main" xmlns:pic="http://schemas.openxmlformats.org/drawingml/2006/picture" xmlns:wp="http://schemas.openxmlformats.org/drawingml/2006/wordprocessingDrawing">
   <w:body>
-    <w:bookmarkStart w:id="13" w:name="robin-macharg"/>
+    <w:bookmarkStart w:id="15" w:name="robin-macharg"/>
     <w:p>
       <w:pPr>
         <w:pStyle w:val="Heading1"/>
@@ -108,7 +108,7 @@
           <w:i/>
           <w:iCs/>
         </w:rPr>
-        <w:t xml:space="preserve">Security-cleared native mobile engineer</w:t>
+        <w:t xml:space="preserve">Senior iOS &amp; Security Architect:</w:t>
       </w:r>
       <w:r>
         <w:rPr>
@@ -122,7 +122,7 @@
           <w:i/>
           <w:iCs/>
         </w:rPr>
-        <w:t xml:space="preserve">with extensive commercial experience delivering robust, high-performance iOS applications and SDKs using Swift, Objective-C, and C/C++.</w:t>
+        <w:t xml:space="preserve">Hands-on engineer with extensive experience developing secure, high-performance native iOS applications in Swift and Objective-C, combined with previous UK Government SC1 Security Clearance and secure device integration expertise.</w:t>
       </w:r>
     </w:p>
     <w:p>
@@ -136,7 +136,7 @@
           <w:i/>
           <w:iCs/>
         </w:rPr>
-        <w:t xml:space="preserve">Proven track record in secure architectures</w:t>
+        <w:t xml:space="preserve">App Store Shipping &amp; Scale:</w:t>
       </w:r>
       <w:r>
         <w:rPr>
@@ -150,7 +150,7 @@
           <w:i/>
           <w:iCs/>
         </w:rPr>
-        <w:t xml:space="preserve">including VPN-secured Government communications (SC Cleared) and penetration-remediated enterprise applications.</w:t>
+        <w:t xml:space="preserve">Proven history of shipping and managing live applications on the Apple App Store, including sole ownership of a 13-app white-label portfolio driving £30M+ in annual revenue for blue-chip clients.</w:t>
       </w:r>
     </w:p>
     <w:p>
@@ -164,7 +164,7 @@
           <w:i/>
           <w:iCs/>
         </w:rPr>
-        <w:t xml:space="preserve">Deep expertise in modern development patterns</w:t>
+        <w:t xml:space="preserve">Low-Level &amp; Diagnostics Specialist:</w:t>
       </w:r>
       <w:r>
         <w:rPr>
@@ -178,7 +178,7 @@
           <w:i/>
           <w:iCs/>
         </w:rPr>
-        <w:t xml:space="preserve">such as MVVM, Clean Architecture, Composable Architecture (TCA), and multi-platform native SDK design.</w:t>
+        <w:t xml:space="preserve">Strong capability in C/C++ native integrations, memory optimization, low-level networking, and deep-dive crash log diagnostics developed while maintaining core enterprise SDK libraries.</w:t>
       </w:r>
     </w:p>
     <w:p>
@@ -192,7 +192,7 @@
           <w:i/>
           <w:iCs/>
         </w:rPr>
-        <w:t xml:space="preserve">End-to-end automation specialist</w:t>
+        <w:t xml:space="preserve">Continuous Automation &amp; Delivery:</w:t>
       </w:r>
       <w:r>
         <w:rPr>
@@ -206,7 +206,7 @@
           <w:i/>
           <w:iCs/>
         </w:rPr>
-        <w:t xml:space="preserve">expert in App Store Connect, TestFlight, Fastlane, and high-efficiency CI/CD pipeline optimization.</w:t>
+        <w:t xml:space="preserve">Highly proficient in modern devops and release tooling, including Xcode, TestFlight, App Store Connect, Fastlane, and GitHub Actions, successfully slashing release deployment times by up to 90%.</w:t>
       </w:r>
     </w:p>
     <w:p>
@@ -220,7 +220,7 @@
           <w:i/>
           <w:iCs/>
         </w:rPr>
-        <w:t xml:space="preserve">Accomplished collaborative lead</w:t>
+        <w:t xml:space="preserve">Collaborative Engineering Leader:</w:t>
       </w:r>
       <w:r>
         <w:rPr>
@@ -234,7 +234,7 @@
           <w:i/>
           <w:iCs/>
         </w:rPr>
-        <w:t xml:space="preserve">with a focus on Agile processes, mentoring junior developers, and scaling white-label platforms.</w:t>
+        <w:t xml:space="preserve">Certified Scrum Master with a strong track record of mentoring international teams, establishing rigorous Git workflows, and successfully managing security audits and penetration testing.</w:t>
       </w:r>
     </w:p>
     <w:p>
@@ -246,7 +246,7 @@
           <w:b/>
           <w:bCs/>
         </w:rPr>
-        <w:t xml:space="preserve">Security-Focused High-Scale iOS Engineering Alignment</w:t>
+        <w:t xml:space="preserve">Alignment with Native iOS, Security &amp; High-Performance Engineering Requirements</w:t>
       </w:r>
     </w:p>
     <w:p>
@@ -262,13 +262,13 @@
           <w:b/>
           <w:bCs/>
         </w:rPr>
-        <w:t xml:space="preserve">Native iOS Engineering &amp; Tooling:</w:t>
-      </w:r>
-      <w:r>
-        <w:t xml:space="preserve"> </w:t>
-      </w:r>
-      <w:r>
-        <w:t xml:space="preserve">Proficient with Swift, Objective-C, Xcode, TestFlight, and App Store Connect, delivering multiple live apps to the Apple App Store.</w:t>
+        <w:t xml:space="preserve">Native iOS Mastery (Swift &amp; Objective-C):</w:t>
+      </w:r>
+      <w:r>
+        <w:t xml:space="preserve"> </w:t>
+      </w:r>
+      <w:r>
+        <w:t xml:space="preserve">Over a decade of deep native iOS experience designing clean, maintainable MVVM and Redux/TCA architectures using the iOS SDK, Xcode, and modern language paradigms.</w:t>
       </w:r>
     </w:p>
     <w:p>
@@ -284,13 +284,13 @@
           <w:b/>
           <w:bCs/>
         </w:rPr>
-        <w:t xml:space="preserve">Secure &amp; Optimized Architecture:</w:t>
-      </w:r>
-      <w:r>
-        <w:t xml:space="preserve"> </w:t>
-      </w:r>
-      <w:r>
-        <w:t xml:space="preserve">Deep hands-on experience implementing MVVM, TCA, and Clean Architecture alongside low-level C++, cryptography, and secure interop.</w:t>
+        <w:t xml:space="preserve">App Store Shipping Experience:</w:t>
+      </w:r>
+      <w:r>
+        <w:t xml:space="preserve"> </w:t>
+      </w:r>
+      <w:r>
+        <w:t xml:space="preserve">Robust track record of publishing and maintaining enterprise-grade, high-traffic consumer and business applications live on the App Store using TestFlight and App Store Connect.</w:t>
       </w:r>
     </w:p>
     <w:p>
@@ -306,13 +306,13 @@
           <w:b/>
           <w:bCs/>
         </w:rPr>
-        <w:t xml:space="preserve">Rigorous Penetration &amp; Security Remediations:</w:t>
-      </w:r>
-      <w:r>
-        <w:t xml:space="preserve"> </w:t>
-      </w:r>
-      <w:r>
-        <w:t xml:space="preserve">Proven ability to implement secure device identity, VPN-secured local storage, SSO, and secure payment integrations.</w:t>
+        <w:t xml:space="preserve">Performance, Security &amp; Diagnostics:</w:t>
+      </w:r>
+      <w:r>
+        <w:t xml:space="preserve"> </w:t>
+      </w:r>
+      <w:r>
+        <w:t xml:space="preserve">Expert diagnostic skills utilizing Objective-C/C++ and low-level stack-trace analysis to resolve complex security, performance bottlenecks, and crash bugs at scale.</w:t>
       </w:r>
     </w:p>
     <w:p>
@@ -328,13 +328,13 @@
           <w:b/>
           <w:bCs/>
         </w:rPr>
-        <w:t xml:space="preserve">Scalable Product Delivery:</w:t>
-      </w:r>
-      <w:r>
-        <w:t xml:space="preserve"> </w:t>
-      </w:r>
-      <w:r>
-        <w:t xml:space="preserve">Led white-label platforms scaling to 13 applications, driving over £30M+ in annual revenue with automated release processes.</w:t>
+        <w:t xml:space="preserve">Secure Architectures &amp; TEE/VPN Experience:</w:t>
+      </w:r>
+      <w:r>
+        <w:t xml:space="preserve"> </w:t>
+      </w:r>
+      <w:r>
+        <w:t xml:space="preserve">Direct experience building secure, custom VPN-encrypted applications for government projects, implementing enterprise SSO, and handling penetration testing remediations.</w:t>
       </w:r>
     </w:p>
     <w:p>
@@ -350,13 +350,13 @@
           <w:b/>
           <w:bCs/>
         </w:rPr>
-        <w:t xml:space="preserve">Low-Level Debugging &amp; Crash Analysis:</w:t>
-      </w:r>
-      <w:r>
-        <w:t xml:space="preserve"> </w:t>
-      </w:r>
-      <w:r>
-        <w:t xml:space="preserve">Extensive experience diagnosing complex tracebacks, memory leaks, and low-level system integrations for SDK environments.</w:t>
+        <w:t xml:space="preserve">Automated Release Workflows:</w:t>
+      </w:r>
+      <w:r>
+        <w:t xml:space="preserve"> </w:t>
+      </w:r>
+      <w:r>
+        <w:t xml:space="preserve">Proficient in designing automated Fastlane and GitHub Actions pipelines to streamline App Store Connect distribution, code signing, and SDK delivery.</w:t>
       </w:r>
     </w:p>
     <w:p>
@@ -372,13 +372,13 @@
           <w:b/>
           <w:bCs/>
         </w:rPr>
-        <w:t xml:space="preserve">Agile &amp; Collaborative Workflows:</w:t>
-      </w:r>
-      <w:r>
-        <w:t xml:space="preserve"> </w:t>
-      </w:r>
-      <w:r>
-        <w:t xml:space="preserve">Certified Scrum Master possessing excellent track record working within international, multi-component development teams.</w:t>
+        <w:t xml:space="preserve">Collaborative Delivery &amp; Git Workflows:</w:t>
+      </w:r>
+      <w:r>
+        <w:t xml:space="preserve"> </w:t>
+      </w:r>
+      <w:r>
+        <w:t xml:space="preserve">Certified Scrum Master with extensive experience leading Agile engineering teams, designing git-push hooks, and collaborating via structured peer-review pipelines.</w:t>
       </w:r>
     </w:p>
     <w:p>
@@ -424,8 +424,30 @@
         </w:numPr>
       </w:pPr>
       <w:r>
+        <w:rPr>
+          <w:b/>
+          <w:bCs/>
+        </w:rPr>
         <w:t xml:space="preserve">Certified Scrum Master (CSM)</w:t>
       </w:r>
+      <w:r>
+        <w:t xml:space="preserve"> </w:t>
+      </w:r>
+      <w:r>
+        <w:t xml:space="preserve">— Scrum Alliance</w:t>
+      </w:r>
+    </w:p>
+    <w:p>
+      <w:pPr>
+        <w:pStyle w:val="Compact"/>
+        <w:numPr>
+          <w:ilvl w:val="0"/>
+          <w:numId w:val="1002"/>
+        </w:numPr>
+      </w:pPr>
+      <w:r>
+        <w:t xml:space="preserve">Previous UK Government SC1 Security Clearance (6 concurrent DBS checks)</w:t>
+      </w:r>
     </w:p>
     <w:p>
       <w:pPr>
@@ -454,13 +476,24 @@
         <w:t xml:space="preserve"> </w:t>
       </w:r>
       <w:r>
-        <w:t xml:space="preserve">November 2023 - Present</w:t>
-      </w:r>
-      <w:r>
-        <w:t xml:space="preserve"> </w:t>
-      </w:r>
-      <w:r>
-        <w:t xml:space="preserve">Keywords: [React Native, TypeScript, iOS/Android, CI/CD (Fastlane/Azure), Apple/Google Pay, SSO, Penetration Testing]</w:t>
+        <w:t xml:space="preserve">November 2023 - Present (</w:t>
+      </w:r>
+      <w:hyperlink r:id="rId13">
+        <w:r>
+          <w:rPr>
+            <w:rStyle w:val="Hyperlink"/>
+          </w:rPr>
+          <w:t xml:space="preserve">AppStore</w:t>
+        </w:r>
+      </w:hyperlink>
+      <w:r>
+        <w:t xml:space="preserve">)</w:t>
+      </w:r>
+      <w:r>
+        <w:t xml:space="preserve"> </w:t>
+      </w:r>
+      <w:r>
+        <w:t xml:space="preserve">Keywords: [React Native, TypeScript, iOS/Android, Cross-Platform Architecture, AI-Assisted Engineering, CI/CD (Fastlane/Azure), OpenAPI, Apple/Google Pay, SSO, White-Label Scaling, Penetration Testing]</w:t>
       </w:r>
     </w:p>
     <w:p>
@@ -472,7 +505,7 @@
         </w:numPr>
       </w:pPr>
       <w:r>
-        <w:t xml:space="preserve">Commercial Ownership &amp; Scale: Solely maintained a 60K-line multi-tenant codebase driving £30M+ annual revenue across 13 white-label iOS/Android apps for flagship enterprise clients.</w:t>
+        <w:t xml:space="preserve">Sole maintainer of a 60K-line multi-tenant codebase driving £30M+ in annual revenue (70% of company turnover) across 13 white-label iOS/Android applications for flagship enterprise clients including Costa, BMW, EasyJet, Heathrow, and GWR.</w:t>
       </w:r>
     </w:p>
     <w:p>
@@ -484,7 +517,7 @@
         </w:numPr>
       </w:pPr>
       <w:r>
-        <w:t xml:space="preserve">Platform Security &amp; Enterprise Payments: Led native component wrapping (Swift/Kotlin) for secure Apple/Google Pay integrations, executed penetration testing remediations, and integrated enterprise SSO.</w:t>
+        <w:t xml:space="preserve">Reduced mobile engineering costs by over 50% by successfully insourcing the entire 13-app catalog from an external agency and leading architectural migrations.</w:t>
       </w:r>
     </w:p>
     <w:p>
@@ -496,7 +529,19 @@
         </w:numPr>
       </w:pPr>
       <w:r>
-        <w:t xml:space="preserve">Automation &amp; CI/CD: Built end-to-end pipelines (Fastlane, Azure, OpenAPI) to slash new application deployment times by 90%.</w:t>
+        <w:t xml:space="preserve">Built end-to-end automation pipelines using Fastlane, Azure Pipelines, and custom TUIs, slashing new app creation and App Store deployment times by 90%.</w:t>
+      </w:r>
+    </w:p>
+    <w:p>
+      <w:pPr>
+        <w:pStyle w:val="Compact"/>
+        <w:numPr>
+          <w:ilvl w:val="0"/>
+          <w:numId w:val="1003"/>
+        </w:numPr>
+      </w:pPr>
+      <w:r>
+        <w:t xml:space="preserve">Led native component wrapping (Swift/Kotlin) for Apple Pay and Google Pay integrations, executed security penetration testing remediations, and integrated enterprise SSO.</w:t>
       </w:r>
     </w:p>
     <w:p>
@@ -508,19 +553,30 @@
           <w:b/>
           <w:bCs/>
         </w:rPr>
-        <w:t xml:space="preserve">Senior iOS Developer | Sky</w:t>
-      </w:r>
-      <w:r>
-        <w:t xml:space="preserve"> </w:t>
-      </w:r>
-      <w:r>
-        <w:t xml:space="preserve">October 2021 - April 2022</w:t>
-      </w:r>
-      <w:r>
-        <w:t xml:space="preserve"> </w:t>
-      </w:r>
-      <w:r>
-        <w:t xml:space="preserve">Keywords: [Swift, Kotlin Multiplatform, SwiftUI, Video Streaming SDKs, Agile, Release Automation]</w:t>
+        <w:t xml:space="preserve">Senior Developer | Floww Ltd.</w:t>
+      </w:r>
+      <w:r>
+        <w:t xml:space="preserve"> </w:t>
+      </w:r>
+      <w:r>
+        <w:t xml:space="preserve">May 2023 - September 2023 (</w:t>
+      </w:r>
+      <w:hyperlink r:id="rId14">
+        <w:r>
+          <w:rPr>
+            <w:rStyle w:val="Hyperlink"/>
+          </w:rPr>
+          <w:t xml:space="preserve">AppStore</w:t>
+        </w:r>
+      </w:hyperlink>
+      <w:r>
+        <w:t xml:space="preserve">)</w:t>
+      </w:r>
+      <w:r>
+        <w:t xml:space="preserve"> </w:t>
+      </w:r>
+      <w:r>
+        <w:t xml:space="preserve">Keywords: [iOS, SwiftUI, TCA, Redux, GitHub Actions, CI/CD, Mentoring, Shell Scripting, Optimization]</w:t>
       </w:r>
     </w:p>
     <w:p>
@@ -532,7 +588,7 @@
         </w:numPr>
       </w:pPr>
       <w:r>
-        <w:t xml:space="preserve">High-Scale SDK Management: Maintained a hybrid Swift and Kotlin Multiplatform Mobile (KMM) SDK and reference apps utilized daily by over 25 million customers.</w:t>
+        <w:t xml:space="preserve">Developed critical features for a high-security private investment market mobile platform using modern Redux-like Composable Architecture (TCA) and SwiftUI.</w:t>
       </w:r>
     </w:p>
     <w:p>
@@ -544,7 +600,7 @@
         </w:numPr>
       </w:pPr>
       <w:r>
-        <w:t xml:space="preserve">Engineering Improvement: Rewrote the internal SDK reference application using SwiftUI, ensuring highly optimized performance and clean architecture.</w:t>
+        <w:t xml:space="preserve">Maintained and optimized CI/CD pipelines utilizing GitHub Actions and custom shell scripts to ensure robust code quality controls.</w:t>
       </w:r>
     </w:p>
     <w:p>
@@ -556,7 +612,7 @@
         </w:numPr>
       </w:pPr>
       <w:r>
-        <w:t xml:space="preserve">Release &amp; Delivery: Managed bi-weekly release cycles, release notes, and custom Probot/Octokit GitHub tools for repo automation.</w:t>
+        <w:t xml:space="preserve">Introduced and enforced development best practices, including SwiftUI previews, compile-time monitoring, git-push lint hooks, and App startup-time optimizations.</w:t>
       </w:r>
     </w:p>
     <w:p>
@@ -580,7 +636,7 @@
         <w:t xml:space="preserve"> </w:t>
       </w:r>
       <w:r>
-        <w:t xml:space="preserve">Keywords: [Objective-C, C++, iOS, macOS, Crash Reporting, Open Source, Diagnostics]</w:t>
+        <w:t xml:space="preserve">Keywords: [Objective-C, C++, iOS, macOS, watchOS, tvOS, Open Source, Crash Reporting, Diagnostics, Optimization]</w:t>
       </w:r>
     </w:p>
     <w:p>
@@ -592,7 +648,7 @@
         </w:numPr>
       </w:pPr>
       <w:r>
-        <w:t xml:space="preserve">Low-Level Diagnostics &amp; Cocoa/C++: Maintained high-performance open-source Bugsnag Cocoa and C/C++ diagnostic libraries serving global enterprise clients like Netflix, Nintendo, and Amazon.</w:t>
+        <w:t xml:space="preserve">Maintained and optimized open-source Bugsnag crash-reporting libraries for multi-platform Apple ecosystems serving major global enterprises like Netflix, Nintendo, Airbnb, and Amazon.</w:t>
       </w:r>
     </w:p>
     <w:p>
@@ -604,7 +660,7 @@
         </w:numPr>
       </w:pPr>
       <w:r>
-        <w:t xml:space="preserve">Root Cause Engineering: Conducted deep system diagnostics, handling complex multi-threaded stack traces, crash log analysis, and targeted patch releases.</w:t>
+        <w:t xml:space="preserve">Handled 3rd line support isolating complex native stack traces, low-overhead C/C++ exceptions, and publishing robust, lightweight diagnostic patch releases.</w:t>
       </w:r>
     </w:p>
     <w:p>
@@ -616,7 +672,7 @@
         </w:numPr>
       </w:pPr>
       <w:r>
-        <w:t xml:space="preserve">Distribution Engineering: Managed library packaging across CocoaPods, Carthage, SPM, and manual installations.</w:t>
+        <w:t xml:space="preserve">Managed automated SDK packaging and multi-channel distribution across CocoaPods, Carthage, Swift Package Manager (SPM), and manual integrations.</w:t>
       </w:r>
     </w:p>
     <w:p>
@@ -640,7 +696,7 @@
         <w:t xml:space="preserve"> </w:t>
       </w:r>
       <w:r>
-        <w:t xml:space="preserve">Keywords: [Xamarin, C#, Objective-C/Swift Interop, Security, SSL MiM, EWS, Foxhound Project]</w:t>
+        <w:t xml:space="preserve">Keywords: [Xamarin, Visual Studio, C#, Objective-C/Swift Interop, EWS, ReactiveUI, Security, VPN, Charles Proxy]</w:t>
       </w:r>
     </w:p>
     <w:p>
@@ -652,7 +708,7 @@
         </w:numPr>
       </w:pPr>
       <w:r>
-        <w:t xml:space="preserve">Secure Defense Communications: Engineered a custom VPN-secured Exchange email client for the UK Government’s secure Foxhound project.</w:t>
+        <w:t xml:space="preserve">Architected and engineered a custom VPN-secured Exchange email and calendar client for the UK Government’s high-security Foxhound project.</w:t>
       </w:r>
     </w:p>
     <w:p>
@@ -664,7 +720,7 @@
         </w:numPr>
       </w:pPr>
       <w:r>
-        <w:t xml:space="preserve">Secure Interoperability: Developed robust, secure interop bindings between Xamarin/C# and Objective-C/Swift utilizing .NET embedding.</w:t>
+        <w:t xml:space="preserve">Built high-performance, cross-language native interoperability between Xamarin/C# and Objective-C/Swift using .NET Embedding frameworks.</w:t>
       </w:r>
     </w:p>
     <w:p>
@@ -676,19 +732,7 @@
         </w:numPr>
       </w:pPr>
       <w:r>
-        <w:t xml:space="preserve">Advanced Network Inspection: Reverse-engineered Exchange Web Services (EWS) using secure SSL Man-in-the-Middle proxying via Charles Proxy.</w:t>
-      </w:r>
-    </w:p>
-    <w:p>
-      <w:pPr>
-        <w:pStyle w:val="Compact"/>
-        <w:numPr>
-          <w:ilvl w:val="0"/>
-          <w:numId w:val="1006"/>
-        </w:numPr>
-      </w:pPr>
-      <w:r>
-        <w:t xml:space="preserve">Modern Reactive Patterns: Implemented MVVM architecture leveraging ReactiveUI, DynamicData, and Realm.NET with robust error handling via Polly.</w:t>
+        <w:t xml:space="preserve">Reverse-engineered Exchange Web Services (EWS) using Charles Proxy SSL Man-in-the-Middle decryption to construct a resilient local syncing mechanism.</w:t>
       </w:r>
     </w:p>
     <w:p>
@@ -712,7 +756,7 @@
         <w:t xml:space="preserve"> </w:t>
       </w:r>
       <w:r>
-        <w:t xml:space="preserve">Keywords: [iOS, Enterprise MDM, ARKit, RealmDB, Swift, Unit Testing, Penetration Testing]</w:t>
+        <w:t xml:space="preserve">Keywords: [iOS, Greenfield, Enterprise MDM, ARKit, RealmDB, Swift, Unit Testing, Penetration Testing]</w:t>
       </w:r>
     </w:p>
     <w:p>
@@ -724,13 +768,13 @@
         </w:numPr>
       </w:pPr>
       <w:r>
-        <w:t xml:space="preserve">Enterprise iOS Engineering: Designed and delivered Dyson’s first B2B sales iPad app (</w:t>
+        <w:t xml:space="preserve">Sole developer delivering Dyson’s first B2B sales iPad application (</w:t>
       </w:r>
       <w:r>
         <w:t xml:space="preserve">‘Hero’</w:t>
       </w:r>
       <w:r>
-        <w:t xml:space="preserve">) for global deployment to hundreds of staff.</w:t>
+        <w:t xml:space="preserve">) from greenfield to global field test in 8 weeks, expanding the app to 23k lines of code.</w:t>
       </w:r>
     </w:p>
     <w:p>
@@ -742,7 +786,7 @@
         </w:numPr>
       </w:pPr>
       <w:r>
-        <w:t xml:space="preserve">Secure Enterprise Integration: Managed end-to-end integration covering AirWatch enterprise MDM deployment, extensive penetration testing, and secure CMS backends.</w:t>
+        <w:t xml:space="preserve">Achieved &gt;80% code coverage across unit and UI test suites while utilizing custom Xcode templates to enforce a clean, testable MVVM architecture.</w:t>
       </w:r>
     </w:p>
     <w:p>
@@ -754,7 +798,7 @@
         </w:numPr>
       </w:pPr>
       <w:r>
-        <w:t xml:space="preserve">Robust Architecture &amp; Testing: Achieved over 80% UI and Unit Test coverage utilizing RealmDB and custom Xcode project templates.</w:t>
+        <w:t xml:space="preserve">Managed end-to-end enterprise Mobile Device Management (MDM via AirWatch) deployment, resolved penetration testing vulnerability findings, and integrated secure CMS backends.</w:t>
       </w:r>
     </w:p>
     <w:p>
@@ -778,13 +822,13 @@
           <w:b/>
           <w:bCs/>
         </w:rPr>
-        <w:t xml:space="preserve">2012 - 2023</w:t>
-      </w:r>
-      <w:r>
-        <w:t xml:space="preserve"> </w:t>
-      </w:r>
-      <w:r>
-        <w:t xml:space="preserve">Broad engineering roles spanning private equity fintech platforms, mapping SDKs, startup growth, and high-performance network analytics.</w:t>
+        <w:t xml:space="preserve">1996 - 2023</w:t>
+      </w:r>
+      <w:r>
+        <w:t xml:space="preserve"> </w:t>
+      </w:r>
+      <w:r>
+        <w:t xml:space="preserve">Multi-platform engineering, senior mobile SDK delivery, network analytics, and DevOps positions across diverse sectors.</w:t>
       </w:r>
     </w:p>
     <w:p>
@@ -800,7 +844,7 @@
           <w:b/>
           <w:bCs/>
         </w:rPr>
-        <w:t xml:space="preserve">Senior Developer</w:t>
+        <w:t xml:space="preserve">Lead Mobile Developer</w:t>
       </w:r>
       <w:r>
         <w:t xml:space="preserve"> </w:t>
@@ -816,13 +860,13 @@
           <w:i/>
           <w:iCs/>
         </w:rPr>
-        <w:t xml:space="preserve">Floww Ltd</w:t>
-      </w:r>
-      <w:r>
-        <w:t xml:space="preserve"> </w:t>
-      </w:r>
-      <w:r>
-        <w:t xml:space="preserve">(iOS, SwiftUI, TCA, Redux, CI/CD, Git hooks)</w:t>
+        <w:t xml:space="preserve">This One Ltd.</w:t>
+      </w:r>
+      <w:r>
+        <w:t xml:space="preserve"> </w:t>
+      </w:r>
+      <w:r>
+        <w:t xml:space="preserve">(SwiftUI, Combine, Async/Await, Python, Flask, Fastlane, GCP, Firebase, ML)</w:t>
       </w:r>
     </w:p>
     <w:p>
@@ -838,7 +882,7 @@
           <w:b/>
           <w:bCs/>
         </w:rPr>
-        <w:t xml:space="preserve">Lead Mobile Developer</w:t>
+        <w:t xml:space="preserve">Senior iOS Developer</w:t>
       </w:r>
       <w:r>
         <w:t xml:space="preserve"> </w:t>
@@ -854,13 +898,13 @@
           <w:i/>
           <w:iCs/>
         </w:rPr>
-        <w:t xml:space="preserve">This One Ltd</w:t>
-      </w:r>
-      <w:r>
-        <w:t xml:space="preserve"> </w:t>
-      </w:r>
-      <w:r>
-        <w:t xml:space="preserve">(SwiftUI, Combine, Async/Await, Python, Flask, Fastlane, GCP)</w:t>
+        <w:t xml:space="preserve">Sky</w:t>
+      </w:r>
+      <w:r>
+        <w:t xml:space="preserve"> </w:t>
+      </w:r>
+      <w:r>
+        <w:t xml:space="preserve">(Swift, Kotlin Multiplatform, SwiftUI, Video Streaming, Analytics, Agile)</w:t>
       </w:r>
     </w:p>
     <w:p>
@@ -892,13 +936,13 @@
           <w:i/>
           <w:iCs/>
         </w:rPr>
-        <w:t xml:space="preserve">Living Map Ltd</w:t>
-      </w:r>
-      <w:r>
-        <w:t xml:space="preserve"> </w:t>
-      </w:r>
-      <w:r>
-        <w:t xml:space="preserve">(iOS, XCFrameworks, CocoaPods, Carthage, Background Location)</w:t>
+        <w:t xml:space="preserve">Living Map Ltd.</w:t>
+      </w:r>
+      <w:r>
+        <w:t xml:space="preserve"> </w:t>
+      </w:r>
+      <w:r>
+        <w:t xml:space="preserve">(iOS, Mapping SDK, XCFrameworks, CocoaPods, Carthage, Background Location, UX)</w:t>
       </w:r>
     </w:p>
     <w:p>
@@ -936,7 +980,7 @@
         <w:t xml:space="preserve"> </w:t>
       </w:r>
       <w:r>
-        <w:t xml:space="preserve">(Objective-C, Swift, CoreData, Realm, Low-level Networking (ICMP/TCP))</w:t>
+        <w:t xml:space="preserve">(Objective-C, Swift, CoreData, Realm, Networking, Jenkins, Vagrant)</w:t>
       </w:r>
     </w:p>
     <w:p>
@@ -952,7 +996,7 @@
           <w:b/>
           <w:bCs/>
         </w:rPr>
-        <w:t xml:space="preserve">Principal Mobile Developer</w:t>
+        <w:t xml:space="preserve">Principal Mobile Developer (Contract)</w:t>
       </w:r>
       <w:r>
         <w:t xml:space="preserve"> </w:t>
@@ -968,7 +1012,7 @@
           <w:i/>
           <w:iCs/>
         </w:rPr>
-        <w:t xml:space="preserve">Accident Exchange Group (Contract)</w:t>
+        <w:t xml:space="preserve">Accident Exchange Group</w:t>
       </w:r>
       <w:r>
         <w:t xml:space="preserve"> </w:t>
@@ -1012,7 +1056,7 @@
         <w:t xml:space="preserve"> </w:t>
       </w:r>
       <w:r>
-        <w:t xml:space="preserve">(Java, Python, JBoss, Puppet, Objective-C)</w:t>
+        <w:t xml:space="preserve">(Java, Python, JBoss, Drools, Puppet, Maven, RPM)</w:t>
       </w:r>
     </w:p>
     <w:p>
@@ -1028,7 +1072,7 @@
           <w:b/>
           <w:bCs/>
         </w:rPr>
-        <w:t xml:space="preserve">Senior Developer / Engineer</w:t>
+        <w:t xml:space="preserve">Senior Developer</w:t>
       </w:r>
       <w:r>
         <w:t xml:space="preserve"> </w:t>
@@ -1044,13 +1088,13 @@
           <w:i/>
           <w:iCs/>
         </w:rPr>
-        <w:t xml:space="preserve">RMS Services Ltd / Airbus UK</w:t>
-      </w:r>
-      <w:r>
-        <w:t xml:space="preserve"> </w:t>
-      </w:r>
-      <w:r>
-        <w:t xml:space="preserve">(Python, PostgreSQL, PyQt, C/C++, OpenGL)</w:t>
+        <w:t xml:space="preserve">RMS Services Ltd.</w:t>
+      </w:r>
+      <w:r>
+        <w:t xml:space="preserve"> </w:t>
+      </w:r>
+      <w:r>
+        <w:t xml:space="preserve">(Python, PostgreSQL, RESTful APIs, Asset Discovery)</w:t>
       </w:r>
     </w:p>
     <w:p>
@@ -1066,7 +1110,7 @@
           <w:b/>
           <w:bCs/>
         </w:rPr>
-        <w:t xml:space="preserve">Server &amp; Embedded Developer</w:t>
+        <w:t xml:space="preserve">Aerodynamics &amp; Mass Properties Engineer</w:t>
       </w:r>
       <w:r>
         <w:t xml:space="preserve"> </w:t>
@@ -1082,13 +1126,51 @@
           <w:i/>
           <w:iCs/>
         </w:rPr>
-        <w:t xml:space="preserve">Sift / Appliance Studio / Obtree</w:t>
-      </w:r>
-      <w:r>
-        <w:t xml:space="preserve"> </w:t>
-      </w:r>
-      <w:r>
-        <w:t xml:space="preserve">(Linux, Embedded Systems, Java, Perl, C)</w:t>
+        <w:t xml:space="preserve">Airbus UK Ltd.</w:t>
+      </w:r>
+      <w:r>
+        <w:t xml:space="preserve"> </w:t>
+      </w:r>
+      <w:r>
+        <w:t xml:space="preserve">(Python, PyQt, Perl, Tk, PDL, OpenGL)</w:t>
+      </w:r>
+    </w:p>
+    <w:p>
+      <w:pPr>
+        <w:pStyle w:val="Compact"/>
+        <w:numPr>
+          <w:ilvl w:val="0"/>
+          <w:numId w:val="1008"/>
+        </w:numPr>
+      </w:pPr>
+      <w:r>
+        <w:rPr>
+          <w:b/>
+          <w:bCs/>
+        </w:rPr>
+        <w:t xml:space="preserve">Server &amp; Embedded Developer</w:t>
+      </w:r>
+      <w:r>
+        <w:t xml:space="preserve"> </w:t>
+      </w:r>
+      <w:r>
+        <w:t xml:space="preserve">|</w:t>
+      </w:r>
+      <w:r>
+        <w:t xml:space="preserve"> </w:t>
+      </w:r>
+      <w:r>
+        <w:rPr>
+          <w:i/>
+          <w:iCs/>
+        </w:rPr>
+        <w:t xml:space="preserve">Sift Ltd. / The Appliance Studio / Obtree / Circle.com / Glaxo Wellcome</w:t>
+      </w:r>
+      <w:r>
+        <w:t xml:space="preserve"> </w:t>
+      </w:r>
+      <w:r>
+        <w:t xml:space="preserve">(Linux, Java, Perl, Embedded Systems, Web Infrastructure)</w:t>
       </w:r>
     </w:p>
     <w:p>
@@ -1112,7 +1194,7 @@
         </w:numPr>
       </w:pPr>
       <w:r>
-        <w:t xml:space="preserve">Bricksmith: SourceForge award-winning LEGO CAD software for macOS (Objective-C/C).</w:t>
+        <w:t xml:space="preserve">Bugsnag Cocoa &amp; C++: Core maintainer of open-source Apple platform crash-reporting libraries, resolving complex stack traces and low-level C++ exceptions.</w:t>
       </w:r>
     </w:p>
     <w:p>
@@ -1124,7 +1206,7 @@
         </w:numPr>
       </w:pPr>
       <w:r>
-        <w:t xml:space="preserve">Pycel: Python-based Excel dependency graph and compiler formula parser.</w:t>
+        <w:t xml:space="preserve">React Native Input Spinner: Key open-source contributor, developing and maintaining custom UI components for the cross-platform community.</w:t>
       </w:r>
     </w:p>
     <w:p>
@@ -1136,7 +1218,7 @@
         </w:numPr>
       </w:pPr>
       <w:r>
-        <w:t xml:space="preserve">React Native Input Spinner: Regular contributor to popular open-source UI component.</w:t>
+        <w:t xml:space="preserve">Pycel / Excel Formula Parser: Core contributor to this Python-based compiler mapping Excel dependency graphs and parsing formulas.</w:t>
       </w:r>
     </w:p>
     <w:p>
@@ -1148,19 +1230,7 @@
         </w:numPr>
       </w:pPr>
       <w:r>
-        <w:t xml:space="preserve">RMHelpfulLabel: Open-source custom iOS UI helper components and utility libraries.</w:t>
-      </w:r>
-    </w:p>
-    <w:p>
-      <w:pPr>
-        <w:pStyle w:val="Compact"/>
-        <w:numPr>
-          <w:ilvl w:val="0"/>
-          <w:numId w:val="1009"/>
-        </w:numPr>
-      </w:pPr>
-      <w:r>
-        <w:t xml:space="preserve">Coding Exercises: Public repository of algorithms and structured programming solutions.</w:t>
+        <w:t xml:space="preserve">Bricksmith: SourceForge award-winning LEGO CAD software for macOS, written in Objective-C and C.</w:t>
       </w:r>
     </w:p>
     <w:p>
@@ -1184,13 +1254,13 @@
           <w:b/>
           <w:bCs/>
         </w:rPr>
-        <w:t xml:space="preserve">Native iOS Ecosystem &amp; Languages</w:t>
-      </w:r>
-      <w:r>
-        <w:t xml:space="preserve"> </w:t>
-      </w:r>
-      <w:r>
-        <w:t xml:space="preserve">- Swift, Objective-C, SwiftUI, Combine, async/await, UIKit, CoreData, RealmDB, XCFrameworks</w:t>
+        <w:t xml:space="preserve">Native iOS &amp; Core Tooling</w:t>
+      </w:r>
+      <w:r>
+        <w:t xml:space="preserve"> </w:t>
+      </w:r>
+      <w:r>
+        <w:t xml:space="preserve">- Swift, Objective-C, iOS SDK, Xcode, TestFlight, App Store Connect, Swift Package Manager (SPM), CocoaPods, Carthage, xcodebuild</w:t>
       </w:r>
     </w:p>
     <w:p>
@@ -1202,13 +1272,13 @@
           <w:b/>
           <w:bCs/>
         </w:rPr>
-        <w:t xml:space="preserve">Security &amp; Architecture</w:t>
-      </w:r>
-      <w:r>
-        <w:t xml:space="preserve"> </w:t>
-      </w:r>
-      <w:r>
-        <w:t xml:space="preserve">- VPN integrations, Penetration testing remediation, SSO, Apple/Google Pay, MVVM, TCA, Clean Architecture, Scrum (CSM)</w:t>
+        <w:t xml:space="preserve">Security, Performance &amp; Diagnostics</w:t>
+      </w:r>
+      <w:r>
+        <w:t xml:space="preserve"> </w:t>
+      </w:r>
+      <w:r>
+        <w:t xml:space="preserve">- UK SC1 Security Clearance, TEE/VPN-secured integrations, Penetration testing remediations, Crash reporting and diagnostics, Memory and compilation optimization, Background Location operations, Raw socket low-level networking</w:t>
       </w:r>
     </w:p>
     <w:p>
@@ -1220,13 +1290,13 @@
           <w:b/>
           <w:bCs/>
         </w:rPr>
-        <w:t xml:space="preserve">Tooling &amp; Delivery</w:t>
-      </w:r>
-      <w:r>
-        <w:t xml:space="preserve"> </w:t>
-      </w:r>
-      <w:r>
-        <w:t xml:space="preserve">- Xcode, TestFlight, App Store Connect, Fastlane, Git, GitHub Actions, Azure Pipelines, xcodebuild, SPM, CocoaPods, Carthage</w:t>
+        <w:t xml:space="preserve">Architecture &amp; Programming Paradigms</w:t>
+      </w:r>
+      <w:r>
+        <w:t xml:space="preserve"> </w:t>
+      </w:r>
+      <w:r>
+        <w:t xml:space="preserve">- Clean Architecture, MVVM, Redux/TCA (Composable Architecture), MVC, ReactiveUI, White-Label Scaling, Kotlin Multiplatform Mobile (KMM)</w:t>
       </w:r>
     </w:p>
     <w:p>
@@ -1238,16 +1308,34 @@
           <w:b/>
           <w:bCs/>
         </w:rPr>
-        <w:t xml:space="preserve">Multi-Platform &amp; Systems</w:t>
-      </w:r>
-      <w:r>
-        <w:t xml:space="preserve"> </w:t>
-      </w:r>
-      <w:r>
-        <w:t xml:space="preserve">- C/C++, Python (FastAPI, Flask), Kotlin Multiplatform (KMM), C#, Docker, Shell Scripting</w:t>
-      </w:r>
-    </w:p>
-    <w:bookmarkEnd w:id="13"/>
+        <w:t xml:space="preserve">Automation &amp; DevOps Pipelines</w:t>
+      </w:r>
+      <w:r>
+        <w:t xml:space="preserve"> </w:t>
+      </w:r>
+      <w:r>
+        <w:t xml:space="preserve">- Fastlane, Azure Pipelines, GitHub Actions, Jenkins, Custom Python/Shell Scripting, Git workflow automation (Probot/Octokit)</w:t>
+      </w:r>
+    </w:p>
+    <w:p>
+      <w:pPr>
+        <w:pStyle w:val="BodyText"/>
+      </w:pPr>
+      <w:r>
+        <w:rPr>
+          <w:b/>
+          <w:bCs/>
+        </w:rPr>
+        <w:t xml:space="preserve">Secondary Languages &amp; Databases</w:t>
+      </w:r>
+      <w:r>
+        <w:t xml:space="preserve"> </w:t>
+      </w:r>
+      <w:r>
+        <w:t xml:space="preserve">- Python (FastAPI, Flask), C/C++, C#, Java, PostgreSQL, RealmDB, CoreData, OpenAPI/RESTful API design</w:t>
+      </w:r>
+    </w:p>
+    <w:bookmarkEnd w:id="15"/>
     <w:sectPr>
       <w:footnotePr>
         <w:numRestart w:val="eachSect"/>

</xml_diff>